<commit_message>
Add hyperlink to personal CV in document header
</commit_message>
<xml_diff>
--- a/assets/Kristaps Kaspars Tavars - CV.docx
+++ b/assets/Kristaps Kaspars Tavars - CV.docx
@@ -9,6 +9,27 @@
       <w:r>
         <w:t>Kristaps Kaspars Tavars</w:t>
       </w:r>
+    </w:p>
+    <w:p>
+      <w:pPr>
+        <w:pStyle w:val="BodyText"/>
+        <w:jc w:val="center"/>
+        <w:rPr>
+          <w:i/>
+          <w:iCs/>
+          <w:u w:val="single"/>
+        </w:rPr>
+      </w:pPr>
+      <w:hyperlink r:id="rId8" w:history="1">
+        <w:r>
+          <w:rPr>
+            <w:rStyle w:val="Hyperlink"/>
+            <w:i/>
+            <w:iCs/>
+          </w:rPr>
+          <w:t>cv.kristapshomelab.com</w:t>
+        </w:r>
+      </w:hyperlink>
     </w:p>
     <w:p>
       <w:pPr>
@@ -100,7 +121,7 @@
       <w:r>
         <w:t xml:space="preserve"> </w:t>
       </w:r>
-      <w:hyperlink r:id="rId7">
+      <w:hyperlink r:id="rId9">
         <w:r>
           <w:rPr>
             <w:rStyle w:val="Hyperlink"/>
@@ -795,6 +816,7 @@
       <w:bookmarkEnd w:id="4"/>
       <w:proofErr w:type="spellStart"/>
       <w:r>
+        <w:lastRenderedPageBreak/>
         <w:t>Iepriekšējā</w:t>
       </w:r>
       <w:proofErr w:type="spellEnd"/>
@@ -887,7 +909,6 @@
       <w:bookmarkEnd w:id="5"/>
       <w:proofErr w:type="spellStart"/>
       <w:r>
-        <w:lastRenderedPageBreak/>
         <w:t>Darba</w:t>
       </w:r>
       <w:proofErr w:type="spellEnd"/>
@@ -2176,6 +2197,7 @@
       <w:bookmarkEnd w:id="12"/>
       <w:proofErr w:type="spellStart"/>
       <w:r>
+        <w:lastRenderedPageBreak/>
         <w:t>Mājaslapu</w:t>
       </w:r>
       <w:proofErr w:type="spellEnd"/>
@@ -2305,7 +2327,6 @@
       <w:bookmarkEnd w:id="13"/>
       <w:proofErr w:type="spellStart"/>
       <w:r>
-        <w:lastRenderedPageBreak/>
         <w:t>Valodu</w:t>
       </w:r>
       <w:proofErr w:type="spellEnd"/>
@@ -4234,6 +4255,7 @@
   <w:style w:type="character" w:default="1" w:styleId="DefaultParagraphFont">
     <w:name w:val="Default Paragraph Font"/>
     <w:uiPriority w:val="1"/>
+    <w:semiHidden/>
     <w:unhideWhenUsed/>
   </w:style>
   <w:style w:type="table" w:default="1" w:styleId="TableNormal">
@@ -4846,6 +4868,18 @@
     <w:rPr>
       <w:i/>
       <w:iCs/>
+    </w:rPr>
+  </w:style>
+  <w:style w:type="character" w:styleId="UnresolvedMention">
+    <w:name w:val="Unresolved Mention"/>
+    <w:basedOn w:val="DefaultParagraphFont"/>
+    <w:uiPriority w:val="99"/>
+    <w:semiHidden/>
+    <w:unhideWhenUsed/>
+    <w:rsid w:val="00870814"/>
+    <w:rPr>
+      <w:color w:val="605E5C"/>
+      <w:shd w:val="clear" w:color="auto" w:fill="E1DFDD"/>
     </w:rPr>
   </w:style>
 </w:styles>
@@ -5167,4 +5201,16 @@
   </a:objectDefaults>
   <a:extraClrSchemeLst/>
 </a:theme>
+</file>
+
+<file path=customXml/item1.xml><?xml version="1.0" encoding="utf-8"?>
+<b:Sources xmlns:b="http://schemas.openxmlformats.org/officeDocument/2006/bibliography" xmlns="http://schemas.openxmlformats.org/officeDocument/2006/bibliography" SelectedStyle="\APASixthEditionOfficeOnline.xsl" StyleName="APA" Version="6"/>
+</file>
+
+<file path=customXml/itemProps1.xml><?xml version="1.0" encoding="utf-8"?>
+<ds:datastoreItem xmlns:ds="http://schemas.openxmlformats.org/officeDocument/2006/customXml" ds:itemID="{2CDFD7F5-DDBC-4DAB-A6DD-6288B376DA35}">
+  <ds:schemaRefs>
+    <ds:schemaRef ds:uri="http://schemas.openxmlformats.org/officeDocument/2006/bibliography"/>
+  </ds:schemaRefs>
+</ds:datastoreItem>
 </file>
</xml_diff>